<commit_message>
lab1 - ToString implementations
</commit_message>
<xml_diff>
--- a/Project_Pushka/docx/NET Звіт Лаб1 КН-923а Пушка ІА.docx
+++ b/Project_Pushka/docx/NET Звіт Лаб1 КН-923а Пушка ІА.docx
@@ -5,8 +5,8 @@
     <w:p>
       <w:pPr>
         <w:widowControl/>
-        <w:spacing w:line="276" w:lineRule="auto"/>
-        <w:ind w:left="7653" w:right="-466"/>
+        <w:spacing w:line="360" w:lineRule="auto"/>
+        <w:ind w:left="7655" w:right="-465"/>
         <w:rPr>
           <w:sz w:val="28"/>
           <w:szCs w:val="28"/>
@@ -25,8 +25,8 @@
     <w:p>
       <w:pPr>
         <w:widowControl/>
-        <w:spacing w:line="276" w:lineRule="auto"/>
-        <w:ind w:left="7653" w:right="-466"/>
+        <w:spacing w:line="360" w:lineRule="auto"/>
+        <w:ind w:left="7655" w:right="-465"/>
         <w:rPr>
           <w:sz w:val="28"/>
           <w:szCs w:val="28"/>
@@ -51,14 +51,12 @@
     <w:p>
       <w:pPr>
         <w:widowControl/>
-        <w:spacing w:line="276" w:lineRule="auto"/>
-        <w:ind w:left="7653" w:right="-466"/>
-        <w:rPr>
-          <w:b/>
-          <w:bCs/>
-          <w:sz w:val="28"/>
-          <w:szCs w:val="28"/>
-          <w:lang w:val="uk-UA"/>
+        <w:spacing w:line="360" w:lineRule="auto"/>
+        <w:ind w:left="7655" w:right="-465"/>
+        <w:rPr>
+          <w:sz w:val="28"/>
+          <w:szCs w:val="28"/>
+          <w:lang w:val="en-US"/>
         </w:rPr>
       </w:pPr>
       <w:r>
@@ -75,6 +73,46 @@
           <w:lang w:val="uk-UA"/>
         </w:rPr>
         <w:t>. А.</w:t>
+      </w:r>
+    </w:p>
+    <w:p>
+      <w:pPr>
+        <w:widowControl/>
+        <w:spacing w:line="360" w:lineRule="auto"/>
+        <w:ind w:left="7655" w:right="-465"/>
+        <w:rPr>
+          <w:sz w:val="28"/>
+          <w:szCs w:val="28"/>
+          <w:lang w:val="uk-UA"/>
+        </w:rPr>
+      </w:pPr>
+      <w:r>
+        <w:rPr>
+          <w:sz w:val="28"/>
+          <w:szCs w:val="28"/>
+          <w:lang w:val="uk-UA"/>
+        </w:rPr>
+        <w:t>Перевірив:</w:t>
+      </w:r>
+    </w:p>
+    <w:p>
+      <w:pPr>
+        <w:widowControl/>
+        <w:spacing w:line="360" w:lineRule="auto"/>
+        <w:ind w:left="7655" w:right="-465"/>
+        <w:rPr>
+          <w:sz w:val="28"/>
+          <w:szCs w:val="28"/>
+          <w:lang w:val="uk-UA"/>
+        </w:rPr>
+      </w:pPr>
+      <w:r>
+        <w:rPr>
+          <w:sz w:val="28"/>
+          <w:szCs w:val="28"/>
+          <w:lang w:val="uk-UA"/>
+        </w:rPr>
+        <w:t>Горносталь О. А.</w:t>
       </w:r>
     </w:p>
     <w:p>
@@ -176,7 +214,25 @@
           <w:sz w:val="28"/>
           <w:szCs w:val="28"/>
         </w:rPr>
-        <w:t>Ознайомитися з архітектурою платформи .NET, навчитися налаштовувати середовище розробки (IDE), опанувати структуру рішень (Solution) та проектів (Project), а також спроектувати базову доменну модель індивідуального проекту.</w:t>
+        <w:t>Ознайомитися з архітектурою платформи .NET, навчитися налаштовувати середовище розробки (IDE), опанувати структуру рішень (</w:t>
+      </w:r>
+      <w:proofErr w:type="spellStart"/>
+      <w:r>
+        <w:rPr>
+          <w:color w:val="000000"/>
+          <w:sz w:val="28"/>
+          <w:szCs w:val="28"/>
+        </w:rPr>
+        <w:t>Solution</w:t>
+      </w:r>
+      <w:proofErr w:type="spellEnd"/>
+      <w:r>
+        <w:rPr>
+          <w:color w:val="000000"/>
+          <w:sz w:val="28"/>
+          <w:szCs w:val="28"/>
+        </w:rPr>
+        <w:t>) та проектів (Project), а також спроектувати базову доменну модель індивідуального проекту.</w:t>
       </w:r>
     </w:p>
     <w:p>
@@ -1080,7 +1136,27 @@
           <w:szCs w:val="28"/>
           <w:lang w:val="uk-UA"/>
         </w:rPr>
-        <w:t xml:space="preserve"> реалізовано вивід інформації про поточну версію ОС та обсяг обсяг оперативної пам</w:t>
+        <w:t xml:space="preserve"> реалізовано вивід інформації про поточну версію ОС та обсяг </w:t>
+      </w:r>
+      <w:proofErr w:type="spellStart"/>
+      <w:r>
+        <w:rPr>
+          <w:color w:val="000000"/>
+          <w:sz w:val="28"/>
+          <w:szCs w:val="28"/>
+          <w:lang w:val="uk-UA"/>
+        </w:rPr>
+        <w:t>обсяг</w:t>
+      </w:r>
+      <w:proofErr w:type="spellEnd"/>
+      <w:r>
+        <w:rPr>
+          <w:color w:val="000000"/>
+          <w:sz w:val="28"/>
+          <w:szCs w:val="28"/>
+          <w:lang w:val="uk-UA"/>
+        </w:rPr>
+        <w:t xml:space="preserve"> оперативної пам</w:t>
       </w:r>
       <w:r>
         <w:rPr>
@@ -2076,15 +2152,37 @@
         </w:rPr>
         <w:t>’</w:t>
       </w:r>
-      <w:r>
-        <w:rPr>
-          <w:color w:val="000000"/>
-          <w:sz w:val="28"/>
-          <w:szCs w:val="28"/>
-          <w:lang w:val="uk-UA"/>
-        </w:rPr>
-        <w:t>єктів у консоль</w:t>
-      </w:r>
+      <w:proofErr w:type="spellStart"/>
+      <w:r>
+        <w:rPr>
+          <w:color w:val="000000"/>
+          <w:sz w:val="28"/>
+          <w:szCs w:val="28"/>
+          <w:lang w:val="uk-UA"/>
+        </w:rPr>
+        <w:t>єктів</w:t>
+      </w:r>
+      <w:proofErr w:type="spellEnd"/>
+      <w:r>
+        <w:rPr>
+          <w:color w:val="000000"/>
+          <w:sz w:val="28"/>
+          <w:szCs w:val="28"/>
+          <w:lang w:val="uk-UA"/>
+        </w:rPr>
+        <w:t xml:space="preserve"> </w:t>
+      </w:r>
+      <w:proofErr w:type="gramStart"/>
+      <w:r>
+        <w:rPr>
+          <w:color w:val="000000"/>
+          <w:sz w:val="28"/>
+          <w:szCs w:val="28"/>
+          <w:lang w:val="uk-UA"/>
+        </w:rPr>
+        <w:t>у консоль</w:t>
+      </w:r>
+      <w:proofErr w:type="gramEnd"/>
     </w:p>
     <w:p>
       <w:pPr>
@@ -2121,7 +2219,61 @@
           <w:sz w:val="28"/>
           <w:szCs w:val="28"/>
         </w:rPr>
-        <w:t>У ході виконання лабораторної роботи було ознайомлено з архітектурою платформи .NET та принципами організації проектів у середовищі розробки. Було спроектовано початкову модель індивідуального проекту для додатку кінотеатру. Для цього створено класи Movie, Session та Ticket, які відображають основні сутності системи. Також було створено тестові екземпляри цих класів і реалізовано виведення їхніх даних у консоль для перевірки коректності роботи.</w:t>
+        <w:t xml:space="preserve">У ході виконання лабораторної роботи було ознайомлено з архітектурою платформи .NET та принципами організації проектів у середовищі розробки. Було спроектовано початкову модель індивідуального проекту для додатку кінотеатру. Для цього створено класи </w:t>
+      </w:r>
+      <w:proofErr w:type="spellStart"/>
+      <w:r>
+        <w:rPr>
+          <w:color w:val="000000"/>
+          <w:sz w:val="28"/>
+          <w:szCs w:val="28"/>
+        </w:rPr>
+        <w:t>Movie</w:t>
+      </w:r>
+      <w:proofErr w:type="spellEnd"/>
+      <w:r>
+        <w:rPr>
+          <w:color w:val="000000"/>
+          <w:sz w:val="28"/>
+          <w:szCs w:val="28"/>
+        </w:rPr>
+        <w:t xml:space="preserve">, </w:t>
+      </w:r>
+      <w:proofErr w:type="spellStart"/>
+      <w:r>
+        <w:rPr>
+          <w:color w:val="000000"/>
+          <w:sz w:val="28"/>
+          <w:szCs w:val="28"/>
+        </w:rPr>
+        <w:t>Session</w:t>
+      </w:r>
+      <w:proofErr w:type="spellEnd"/>
+      <w:r>
+        <w:rPr>
+          <w:color w:val="000000"/>
+          <w:sz w:val="28"/>
+          <w:szCs w:val="28"/>
+        </w:rPr>
+        <w:t xml:space="preserve"> та </w:t>
+      </w:r>
+      <w:proofErr w:type="spellStart"/>
+      <w:r>
+        <w:rPr>
+          <w:color w:val="000000"/>
+          <w:sz w:val="28"/>
+          <w:szCs w:val="28"/>
+        </w:rPr>
+        <w:t>Ticket</w:t>
+      </w:r>
+      <w:proofErr w:type="spellEnd"/>
+      <w:r>
+        <w:rPr>
+          <w:color w:val="000000"/>
+          <w:sz w:val="28"/>
+          <w:szCs w:val="28"/>
+        </w:rPr>
+        <w:t>, які відображають основні сутності системи. Також було створено тестові екземпляри цих класів і реалізовано виведення їхніх даних у консоль для перевірки коректності роботи.</w:t>
       </w:r>
     </w:p>
     <w:sectPr>

</xml_diff>